<commit_message>
Uploading files to portfolio site.
</commit_message>
<xml_diff>
--- a/TIDYTUESDAY/2025-06-17-APIS/misc/linkedin_post_copy.docx
+++ b/TIDYTUESDAY/2025-06-17-APIS/misc/linkedin_post_copy.docx
@@ -249,7 +249,19 @@
         <w:rPr>
           <w:rFonts w:ascii="Aptos" w:hAnsi="Aptos"/>
         </w:rPr>
-        <w:t>otebook: [GitHub link]</w:t>
+        <w:t>otebook:</w:t>
+      </w:r>
+      <w:r>
+        <w:rPr>
+          <w:rFonts w:ascii="Aptos" w:hAnsi="Aptos"/>
+        </w:rPr>
+        <w:t xml:space="preserve"> </w:t>
+      </w:r>
+      <w:r>
+        <w:rPr>
+          <w:rFonts w:ascii="Aptos" w:hAnsi="Aptos"/>
+        </w:rPr>
+        <w:t>https://github.com/stevenvillalon/portfolio/blob/3237e3308e300bd39b8c31248760e2c60716adcc/TIDYTUESDAY/2025-06-17-APIS/2025-06-17_tidy_tuesday_apis_explore_O.qmd</w:t>
       </w:r>
     </w:p>
     <w:p>

</xml_diff>